<commit_message>
Fix front/back split in the Word menu
Word's HTML importer ignores page-break-before on a <div>, so the .docx
ran Breakfast/Lunch/Sides straight into Beverages halfway down page 1 —
printed double-sided, the back page started on the front. The page count
was still 2, which is why this got past the earlier check.

Switched to the <br> + mso-special-character form Word actually honours,
and documented both this and the page-count-is-not-enough check in the
README. Verified by exporting the .docx to PDF and rendering both pages:
page 1 now ends after Sides, page 2 holds the drinks and the footer.

Co-Authored-By: Claude Opus 5 <noreply@anthropic.com>
</commit_message>
<xml_diff>
--- a/print/Shazeedas-Menu-Editable.docx
+++ b/print/Shazeedas-Menu-Editable.docx
@@ -2463,7 +2463,17 @@
       <w:r>
         <w:rPr>
           <w:rFonts w:eastAsia="Times New Roman"/>
+          <w:color w:val="241D13"/>
+          <w:sz w:val="21"/>
+          <w:szCs w:val="21"/>
         </w:rPr>
+        <w:br w:type="page"/>
+      </w:r>
+      <w:r>
+        <w:rPr>
+          <w:rFonts w:eastAsia="Times New Roman"/>
+        </w:rPr>
+        <w:lastRenderedPageBreak/>
         <w:t>Shazeeda's Brews &amp; Bites</w:t>
       </w:r>
     </w:p>
@@ -2965,7 +2975,6 @@
                 <w:sz w:val="21"/>
                 <w:szCs w:val="21"/>
               </w:rPr>
-              <w:lastRenderedPageBreak/>
               <w:t>Diamond Sparkling Water (355 ml)</w:t>
             </w:r>
           </w:p>
@@ -4919,7 +4928,7 @@
       <w:pPr>
         <w:spacing w:after="40"/>
         <w:outlineLvl w:val="3"/>
-        <w:divId w:val="1868176514"/>
+        <w:divId w:val="158160795"/>
         <w:rPr>
           <w:rFonts w:ascii="Georgia" w:eastAsia="Times New Roman" w:hAnsi="Georgia"/>
           <w:b/>
@@ -4948,7 +4957,7 @@
     <w:p>
       <w:pPr>
         <w:spacing w:after="20"/>
-        <w:divId w:val="1868176514"/>
+        <w:divId w:val="158160795"/>
         <w:rPr>
           <w:rFonts w:ascii="Georgia" w:hAnsi="Georgia"/>
           <w:color w:val="241D13"/>
@@ -4969,7 +4978,7 @@
     <w:p>
       <w:pPr>
         <w:spacing w:after="20"/>
-        <w:divId w:val="1868176514"/>
+        <w:divId w:val="158160795"/>
         <w:rPr>
           <w:rFonts w:ascii="Georgia" w:hAnsi="Georgia"/>
           <w:color w:val="241D13"/>
@@ -4990,7 +4999,7 @@
     <w:p>
       <w:pPr>
         <w:spacing w:after="20"/>
-        <w:divId w:val="1868176514"/>
+        <w:divId w:val="158160795"/>
         <w:rPr>
           <w:rFonts w:ascii="Georgia" w:hAnsi="Georgia"/>
           <w:color w:val="241D13"/>
@@ -5012,7 +5021,7 @@
       <w:pPr>
         <w:spacing w:before="200" w:after="40"/>
         <w:outlineLvl w:val="3"/>
-        <w:divId w:val="1868176514"/>
+        <w:divId w:val="158160795"/>
         <w:rPr>
           <w:rFonts w:ascii="Georgia" w:eastAsia="Times New Roman" w:hAnsi="Georgia"/>
           <w:b/>
@@ -5041,7 +5050,7 @@
     <w:p>
       <w:pPr>
         <w:spacing w:after="20"/>
-        <w:divId w:val="1868176514"/>
+        <w:divId w:val="158160795"/>
         <w:rPr>
           <w:rFonts w:ascii="Georgia" w:hAnsi="Georgia"/>
           <w:color w:val="241D13"/>
@@ -5063,7 +5072,7 @@
       <w:pPr>
         <w:pStyle w:val="fine1"/>
         <w:spacing w:before="120"/>
-        <w:divId w:val="1868176514"/>
+        <w:divId w:val="158160795"/>
         <w:rPr>
           <w:rFonts w:ascii="Georgia" w:hAnsi="Georgia"/>
         </w:rPr>
@@ -5078,7 +5087,7 @@
     <w:p>
       <w:pPr>
         <w:pStyle w:val="fine1"/>
-        <w:divId w:val="1868176514"/>
+        <w:divId w:val="158160795"/>
         <w:rPr>
           <w:rFonts w:ascii="Georgia" w:hAnsi="Georgia"/>
         </w:rPr>
@@ -5695,14 +5704,6 @@
       <w:szCs w:val="17"/>
     </w:rPr>
   </w:style>
-  <w:style w:type="paragraph" w:customStyle="1" w:styleId="pagebreak">
-    <w:name w:val="pagebreak"/>
-    <w:basedOn w:val="Normal"/>
-    <w:pPr>
-      <w:pageBreakBefore/>
-      <w:spacing w:before="100" w:beforeAutospacing="1" w:after="100" w:afterAutospacing="1"/>
-    </w:pPr>
-  </w:style>
   <w:style w:type="paragraph" w:customStyle="1" w:styleId="fine1">
     <w:name w:val="fine1"/>
     <w:basedOn w:val="Normal"/>

</xml_diff>

<commit_message>
Match menu naming to the owner's final decisions
Owner kept "Popcorn" as-is, so the "(Regular)" qualifier is reverted. The
coffee item is named "Coffee (Black)" to match the wording now in the
Google Sheet, which is the source of truth for the live menu.

Sheet, data/menu.json, menu-template.csv, the print PDF and the Word file
now agree on all 54 items (name, category, price) and on all descriptions
bar one cell still to be cleared in the sheet by hand.

Co-Authored-By: Claude Opus 5 <noreply@anthropic.com>
</commit_message>
<xml_diff>
--- a/print/Shazeedas-Menu-Editable.docx
+++ b/print/Shazeedas-Menu-Editable.docx
@@ -108,7 +108,7 @@
                 <w:sz w:val="21"/>
                 <w:szCs w:val="21"/>
               </w:rPr>
-              <w:t>Coffee Black</w:t>
+              <w:t>Coffee (Black)</w:t>
             </w:r>
           </w:p>
         </w:tc>
@@ -2022,7 +2022,7 @@
                 <w:sz w:val="21"/>
                 <w:szCs w:val="21"/>
               </w:rPr>
-              <w:t>Popcorn (Regular)</w:t>
+              <w:t>Popcorn</w:t>
             </w:r>
           </w:p>
         </w:tc>
@@ -4928,7 +4928,7 @@
       <w:pPr>
         <w:spacing w:after="40"/>
         <w:outlineLvl w:val="3"/>
-        <w:divId w:val="158160795"/>
+        <w:divId w:val="195508964"/>
         <w:rPr>
           <w:rFonts w:ascii="Georgia" w:eastAsia="Times New Roman" w:hAnsi="Georgia"/>
           <w:b/>
@@ -4957,7 +4957,7 @@
     <w:p>
       <w:pPr>
         <w:spacing w:after="20"/>
-        <w:divId w:val="158160795"/>
+        <w:divId w:val="195508964"/>
         <w:rPr>
           <w:rFonts w:ascii="Georgia" w:hAnsi="Georgia"/>
           <w:color w:val="241D13"/>
@@ -4978,7 +4978,7 @@
     <w:p>
       <w:pPr>
         <w:spacing w:after="20"/>
-        <w:divId w:val="158160795"/>
+        <w:divId w:val="195508964"/>
         <w:rPr>
           <w:rFonts w:ascii="Georgia" w:hAnsi="Georgia"/>
           <w:color w:val="241D13"/>
@@ -4999,7 +4999,7 @@
     <w:p>
       <w:pPr>
         <w:spacing w:after="20"/>
-        <w:divId w:val="158160795"/>
+        <w:divId w:val="195508964"/>
         <w:rPr>
           <w:rFonts w:ascii="Georgia" w:hAnsi="Georgia"/>
           <w:color w:val="241D13"/>
@@ -5021,7 +5021,7 @@
       <w:pPr>
         <w:spacing w:before="200" w:after="40"/>
         <w:outlineLvl w:val="3"/>
-        <w:divId w:val="158160795"/>
+        <w:divId w:val="195508964"/>
         <w:rPr>
           <w:rFonts w:ascii="Georgia" w:eastAsia="Times New Roman" w:hAnsi="Georgia"/>
           <w:b/>
@@ -5050,7 +5050,7 @@
     <w:p>
       <w:pPr>
         <w:spacing w:after="20"/>
-        <w:divId w:val="158160795"/>
+        <w:divId w:val="195508964"/>
         <w:rPr>
           <w:rFonts w:ascii="Georgia" w:hAnsi="Georgia"/>
           <w:color w:val="241D13"/>
@@ -5072,7 +5072,7 @@
       <w:pPr>
         <w:pStyle w:val="fine1"/>
         <w:spacing w:before="120"/>
-        <w:divId w:val="158160795"/>
+        <w:divId w:val="195508964"/>
         <w:rPr>
           <w:rFonts w:ascii="Georgia" w:hAnsi="Georgia"/>
         </w:rPr>
@@ -5087,7 +5087,7 @@
     <w:p>
       <w:pPr>
         <w:pStyle w:val="fine1"/>
-        <w:divId w:val="158160795"/>
+        <w:divId w:val="195508964"/>
         <w:rPr>
           <w:rFonts w:ascii="Georgia" w:hAnsi="Georgia"/>
         </w:rPr>

</xml_diff>

<commit_message>
Add the Bagel with Cream Cheese price ($400)
The owner supplied the price that had been missing since the menu was
first built, so the item no longer needs holding back. Removed the
commented-out placeholder from menu-print.html and listed it properly in
both printed versions, in the cheapest-first order those sections use.

All 54 items now carry a price, and the sheet, data/menu.json,
menu-template.csv, the print PDF and the Word file agree on every field.
Both printed versions still fit two pages.

Co-Authored-By: Claude Opus 5 <noreply@anthropic.com>
</commit_message>
<xml_diff>
--- a/print/Shazeedas-Menu-Editable.docx
+++ b/print/Shazeedas-Menu-Editable.docx
@@ -276,6 +276,90 @@
                 <w:sz w:val="21"/>
                 <w:szCs w:val="21"/>
               </w:rPr>
+              <w:t>Bagel with Cream Cheese</w:t>
+            </w:r>
+          </w:p>
+        </w:tc>
+        <w:tc>
+          <w:tcPr>
+            <w:tcW w:w="0" w:type="auto"/>
+            <w:tcBorders>
+              <w:top w:val="nil"/>
+              <w:left w:val="nil"/>
+              <w:bottom w:val="nil"/>
+              <w:right w:val="nil"/>
+            </w:tcBorders>
+            <w:noWrap/>
+            <w:tcMar>
+              <w:top w:w="30" w:type="dxa"/>
+              <w:left w:w="0" w:type="dxa"/>
+              <w:bottom w:w="30" w:type="dxa"/>
+              <w:right w:w="0" w:type="dxa"/>
+            </w:tcMar>
+            <w:vAlign w:val="bottom"/>
+            <w:hideMark/>
+          </w:tcPr>
+          <w:p>
+            <w:pPr>
+              <w:jc w:val="right"/>
+              <w:rPr>
+                <w:rFonts w:ascii="Georgia" w:eastAsia="Times New Roman" w:hAnsi="Georgia"/>
+                <w:b/>
+                <w:bCs/>
+                <w:color w:val="8A6412"/>
+                <w:sz w:val="21"/>
+                <w:szCs w:val="21"/>
+              </w:rPr>
+            </w:pPr>
+            <w:r>
+              <w:rPr>
+                <w:rFonts w:ascii="Georgia" w:eastAsia="Times New Roman" w:hAnsi="Georgia"/>
+                <w:b/>
+                <w:bCs/>
+                <w:color w:val="8A6412"/>
+                <w:sz w:val="21"/>
+                <w:szCs w:val="21"/>
+              </w:rPr>
+              <w:t>$400</w:t>
+            </w:r>
+          </w:p>
+        </w:tc>
+      </w:tr>
+      <w:tr>
+        <w:tc>
+          <w:tcPr>
+            <w:tcW w:w="0" w:type="auto"/>
+            <w:tcBorders>
+              <w:top w:val="nil"/>
+              <w:left w:val="nil"/>
+              <w:bottom w:val="nil"/>
+              <w:right w:val="nil"/>
+            </w:tcBorders>
+            <w:tcMar>
+              <w:top w:w="30" w:type="dxa"/>
+              <w:left w:w="0" w:type="dxa"/>
+              <w:bottom w:w="30" w:type="dxa"/>
+              <w:right w:w="0" w:type="dxa"/>
+            </w:tcMar>
+            <w:vAlign w:val="bottom"/>
+            <w:hideMark/>
+          </w:tcPr>
+          <w:p>
+            <w:pPr>
+              <w:rPr>
+                <w:rFonts w:ascii="Georgia" w:eastAsia="Times New Roman" w:hAnsi="Georgia"/>
+                <w:color w:val="241D13"/>
+                <w:sz w:val="21"/>
+                <w:szCs w:val="21"/>
+              </w:rPr>
+            </w:pPr>
+            <w:r>
+              <w:rPr>
+                <w:rFonts w:ascii="Georgia" w:eastAsia="Times New Roman" w:hAnsi="Georgia"/>
+                <w:color w:val="241D13"/>
+                <w:sz w:val="21"/>
+                <w:szCs w:val="21"/>
+              </w:rPr>
               <w:t>Waffle with Scrambled Egg</w:t>
             </w:r>
           </w:p>
@@ -4928,7 +5012,7 @@
       <w:pPr>
         <w:spacing w:after="40"/>
         <w:outlineLvl w:val="3"/>
-        <w:divId w:val="195508964"/>
+        <w:divId w:val="1598174707"/>
         <w:rPr>
           <w:rFonts w:ascii="Georgia" w:eastAsia="Times New Roman" w:hAnsi="Georgia"/>
           <w:b/>
@@ -4957,7 +5041,7 @@
     <w:p>
       <w:pPr>
         <w:spacing w:after="20"/>
-        <w:divId w:val="195508964"/>
+        <w:divId w:val="1598174707"/>
         <w:rPr>
           <w:rFonts w:ascii="Georgia" w:hAnsi="Georgia"/>
           <w:color w:val="241D13"/>
@@ -4978,7 +5062,7 @@
     <w:p>
       <w:pPr>
         <w:spacing w:after="20"/>
-        <w:divId w:val="195508964"/>
+        <w:divId w:val="1598174707"/>
         <w:rPr>
           <w:rFonts w:ascii="Georgia" w:hAnsi="Georgia"/>
           <w:color w:val="241D13"/>
@@ -4999,7 +5083,7 @@
     <w:p>
       <w:pPr>
         <w:spacing w:after="20"/>
-        <w:divId w:val="195508964"/>
+        <w:divId w:val="1598174707"/>
         <w:rPr>
           <w:rFonts w:ascii="Georgia" w:hAnsi="Georgia"/>
           <w:color w:val="241D13"/>
@@ -5021,7 +5105,7 @@
       <w:pPr>
         <w:spacing w:before="200" w:after="40"/>
         <w:outlineLvl w:val="3"/>
-        <w:divId w:val="195508964"/>
+        <w:divId w:val="1598174707"/>
         <w:rPr>
           <w:rFonts w:ascii="Georgia" w:eastAsia="Times New Roman" w:hAnsi="Georgia"/>
           <w:b/>
@@ -5050,7 +5134,7 @@
     <w:p>
       <w:pPr>
         <w:spacing w:after="20"/>
-        <w:divId w:val="195508964"/>
+        <w:divId w:val="1598174707"/>
         <w:rPr>
           <w:rFonts w:ascii="Georgia" w:hAnsi="Georgia"/>
           <w:color w:val="241D13"/>
@@ -5072,7 +5156,7 @@
       <w:pPr>
         <w:pStyle w:val="fine1"/>
         <w:spacing w:before="120"/>
-        <w:divId w:val="195508964"/>
+        <w:divId w:val="1598174707"/>
         <w:rPr>
           <w:rFonts w:ascii="Georgia" w:hAnsi="Georgia"/>
         </w:rPr>
@@ -5087,7 +5171,7 @@
     <w:p>
       <w:pPr>
         <w:pStyle w:val="fine1"/>
-        <w:divId w:val="195508964"/>
+        <w:divId w:val="1598174707"/>
         <w:rPr>
           <w:rFonts w:ascii="Georgia" w:hAnsi="Georgia"/>
         </w:rPr>

</xml_diff>

<commit_message>
Drop the item descriptions the owner didn't want
Owner asked for the descriptions to go except on Loaded Fries and the ice
cream. Removed them from Linguini Pasta and Popcorn, and shortened the Soft
Serve line to just the flavours.

Both printed versions rebuilt and still fit two pages.

Co-Authored-By: Claude Opus 5 <noreply@anthropic.com>
</commit_message>
<xml_diff>
--- a/print/Shazeedas-Menu-Editable.docx
+++ b/print/Shazeedas-Menu-Editable.docx
@@ -1283,51 +1283,6 @@
         <w:tc>
           <w:tcPr>
             <w:tcW w:w="0" w:type="auto"/>
-            <w:gridSpan w:val="2"/>
-            <w:tcBorders>
-              <w:top w:val="nil"/>
-              <w:left w:val="nil"/>
-              <w:bottom w:val="nil"/>
-              <w:right w:val="nil"/>
-            </w:tcBorders>
-            <w:tcMar>
-              <w:top w:w="0" w:type="dxa"/>
-              <w:left w:w="0" w:type="dxa"/>
-              <w:bottom w:w="40" w:type="dxa"/>
-              <w:right w:w="0" w:type="dxa"/>
-            </w:tcMar>
-            <w:vAlign w:val="bottom"/>
-            <w:hideMark/>
-          </w:tcPr>
-          <w:p>
-            <w:pPr>
-              <w:rPr>
-                <w:rFonts w:ascii="Georgia" w:eastAsia="Times New Roman" w:hAnsi="Georgia"/>
-                <w:i/>
-                <w:iCs/>
-                <w:color w:val="6B5A3E"/>
-                <w:sz w:val="17"/>
-                <w:szCs w:val="17"/>
-              </w:rPr>
-            </w:pPr>
-            <w:r>
-              <w:rPr>
-                <w:rFonts w:ascii="Georgia" w:eastAsia="Times New Roman" w:hAnsi="Georgia"/>
-                <w:i/>
-                <w:iCs/>
-                <w:color w:val="6B5A3E"/>
-                <w:sz w:val="17"/>
-                <w:szCs w:val="17"/>
-              </w:rPr>
-              <w:t>With chicken breast or mince.</w:t>
-            </w:r>
-          </w:p>
-        </w:tc>
-      </w:tr>
-      <w:tr>
-        <w:tc>
-          <w:tcPr>
-            <w:tcW w:w="0" w:type="auto"/>
             <w:tcBorders>
               <w:top w:val="nil"/>
               <w:left w:val="nil"/>
@@ -2151,51 +2106,6 @@
                 <w:szCs w:val="21"/>
               </w:rPr>
               <w:t>$600</w:t>
-            </w:r>
-          </w:p>
-        </w:tc>
-      </w:tr>
-      <w:tr>
-        <w:tc>
-          <w:tcPr>
-            <w:tcW w:w="0" w:type="auto"/>
-            <w:gridSpan w:val="2"/>
-            <w:tcBorders>
-              <w:top w:val="nil"/>
-              <w:left w:val="nil"/>
-              <w:bottom w:val="nil"/>
-              <w:right w:val="nil"/>
-            </w:tcBorders>
-            <w:tcMar>
-              <w:top w:w="0" w:type="dxa"/>
-              <w:left w:w="0" w:type="dxa"/>
-              <w:bottom w:w="40" w:type="dxa"/>
-              <w:right w:w="0" w:type="dxa"/>
-            </w:tcMar>
-            <w:vAlign w:val="bottom"/>
-            <w:hideMark/>
-          </w:tcPr>
-          <w:p>
-            <w:pPr>
-              <w:rPr>
-                <w:rFonts w:ascii="Georgia" w:eastAsia="Times New Roman" w:hAnsi="Georgia"/>
-                <w:i/>
-                <w:iCs/>
-                <w:color w:val="6B5A3E"/>
-                <w:sz w:val="17"/>
-                <w:szCs w:val="17"/>
-              </w:rPr>
-            </w:pPr>
-            <w:r>
-              <w:rPr>
-                <w:rFonts w:ascii="Georgia" w:eastAsia="Times New Roman" w:hAnsi="Georgia"/>
-                <w:i/>
-                <w:iCs/>
-                <w:color w:val="6B5A3E"/>
-                <w:sz w:val="17"/>
-                <w:szCs w:val="17"/>
-              </w:rPr>
-              <w:t>With available toppings.</w:t>
             </w:r>
           </w:p>
         </w:tc>
@@ -5002,7 +4912,7 @@
                 <w:sz w:val="17"/>
                 <w:szCs w:val="17"/>
               </w:rPr>
-              <w:t>Chocolate or vanilla, with available toppings and sauces.</w:t>
+              <w:t>Chocolate or vanilla.</w:t>
             </w:r>
           </w:p>
         </w:tc>
@@ -5012,7 +4922,7 @@
       <w:pPr>
         <w:spacing w:after="40"/>
         <w:outlineLvl w:val="3"/>
-        <w:divId w:val="1598174707"/>
+        <w:divId w:val="195122156"/>
         <w:rPr>
           <w:rFonts w:ascii="Georgia" w:eastAsia="Times New Roman" w:hAnsi="Georgia"/>
           <w:b/>
@@ -5041,7 +4951,7 @@
     <w:p>
       <w:pPr>
         <w:spacing w:after="20"/>
-        <w:divId w:val="1598174707"/>
+        <w:divId w:val="195122156"/>
         <w:rPr>
           <w:rFonts w:ascii="Georgia" w:hAnsi="Georgia"/>
           <w:color w:val="241D13"/>
@@ -5062,7 +4972,7 @@
     <w:p>
       <w:pPr>
         <w:spacing w:after="20"/>
-        <w:divId w:val="1598174707"/>
+        <w:divId w:val="195122156"/>
         <w:rPr>
           <w:rFonts w:ascii="Georgia" w:hAnsi="Georgia"/>
           <w:color w:val="241D13"/>
@@ -5083,7 +4993,7 @@
     <w:p>
       <w:pPr>
         <w:spacing w:after="20"/>
-        <w:divId w:val="1598174707"/>
+        <w:divId w:val="195122156"/>
         <w:rPr>
           <w:rFonts w:ascii="Georgia" w:hAnsi="Georgia"/>
           <w:color w:val="241D13"/>
@@ -5105,7 +5015,7 @@
       <w:pPr>
         <w:spacing w:before="200" w:after="40"/>
         <w:outlineLvl w:val="3"/>
-        <w:divId w:val="1598174707"/>
+        <w:divId w:val="195122156"/>
         <w:rPr>
           <w:rFonts w:ascii="Georgia" w:eastAsia="Times New Roman" w:hAnsi="Georgia"/>
           <w:b/>
@@ -5134,7 +5044,7 @@
     <w:p>
       <w:pPr>
         <w:spacing w:after="20"/>
-        <w:divId w:val="1598174707"/>
+        <w:divId w:val="195122156"/>
         <w:rPr>
           <w:rFonts w:ascii="Georgia" w:hAnsi="Georgia"/>
           <w:color w:val="241D13"/>
@@ -5156,7 +5066,7 @@
       <w:pPr>
         <w:pStyle w:val="fine1"/>
         <w:spacing w:before="120"/>
-        <w:divId w:val="1598174707"/>
+        <w:divId w:val="195122156"/>
         <w:rPr>
           <w:rFonts w:ascii="Georgia" w:hAnsi="Georgia"/>
         </w:rPr>
@@ -5171,7 +5081,7 @@
     <w:p>
       <w:pPr>
         <w:pStyle w:val="fine1"/>
-        <w:divId w:val="1598174707"/>
+        <w:divId w:val="195122156"/>
         <w:rPr>
           <w:rFonts w:ascii="Georgia" w:hAnsi="Georgia"/>
         </w:rPr>

</xml_diff>

<commit_message>
Match the ice cream description to the sheet's wording
The sheet reads "Chocolate or Vanilla"; the files had "Chocolate or
vanilla." Adopted the sheet's form so all four places agree character for
character. Sheet, data/menu.json, menu-template.csv, the print PDF and the
Word file now match exactly on every field of all 54 items.

Co-Authored-By: Claude Opus 5 <noreply@anthropic.com>
</commit_message>
<xml_diff>
--- a/print/Shazeedas-Menu-Editable.docx
+++ b/print/Shazeedas-Menu-Editable.docx
@@ -4912,7 +4912,7 @@
                 <w:sz w:val="17"/>
                 <w:szCs w:val="17"/>
               </w:rPr>
-              <w:t>Chocolate or vanilla.</w:t>
+              <w:t>Chocolate or Vanilla</w:t>
             </w:r>
           </w:p>
         </w:tc>
@@ -4922,7 +4922,7 @@
       <w:pPr>
         <w:spacing w:after="40"/>
         <w:outlineLvl w:val="3"/>
-        <w:divId w:val="195122156"/>
+        <w:divId w:val="1428231209"/>
         <w:rPr>
           <w:rFonts w:ascii="Georgia" w:eastAsia="Times New Roman" w:hAnsi="Georgia"/>
           <w:b/>
@@ -4951,7 +4951,7 @@
     <w:p>
       <w:pPr>
         <w:spacing w:after="20"/>
-        <w:divId w:val="195122156"/>
+        <w:divId w:val="1428231209"/>
         <w:rPr>
           <w:rFonts w:ascii="Georgia" w:hAnsi="Georgia"/>
           <w:color w:val="241D13"/>
@@ -4972,7 +4972,7 @@
     <w:p>
       <w:pPr>
         <w:spacing w:after="20"/>
-        <w:divId w:val="195122156"/>
+        <w:divId w:val="1428231209"/>
         <w:rPr>
           <w:rFonts w:ascii="Georgia" w:hAnsi="Georgia"/>
           <w:color w:val="241D13"/>
@@ -4993,7 +4993,7 @@
     <w:p>
       <w:pPr>
         <w:spacing w:after="20"/>
-        <w:divId w:val="195122156"/>
+        <w:divId w:val="1428231209"/>
         <w:rPr>
           <w:rFonts w:ascii="Georgia" w:hAnsi="Georgia"/>
           <w:color w:val="241D13"/>
@@ -5015,7 +5015,7 @@
       <w:pPr>
         <w:spacing w:before="200" w:after="40"/>
         <w:outlineLvl w:val="3"/>
-        <w:divId w:val="195122156"/>
+        <w:divId w:val="1428231209"/>
         <w:rPr>
           <w:rFonts w:ascii="Georgia" w:eastAsia="Times New Roman" w:hAnsi="Georgia"/>
           <w:b/>
@@ -5044,7 +5044,7 @@
     <w:p>
       <w:pPr>
         <w:spacing w:after="20"/>
-        <w:divId w:val="195122156"/>
+        <w:divId w:val="1428231209"/>
         <w:rPr>
           <w:rFonts w:ascii="Georgia" w:hAnsi="Georgia"/>
           <w:color w:val="241D13"/>
@@ -5066,7 +5066,7 @@
       <w:pPr>
         <w:pStyle w:val="fine1"/>
         <w:spacing w:before="120"/>
-        <w:divId w:val="195122156"/>
+        <w:divId w:val="1428231209"/>
         <w:rPr>
           <w:rFonts w:ascii="Georgia" w:hAnsi="Georgia"/>
         </w:rPr>
@@ -5081,7 +5081,7 @@
     <w:p>
       <w:pPr>
         <w:pStyle w:val="fine1"/>
-        <w:divId w:val="195122156"/>
+        <w:divId w:val="1428231209"/>
         <w:rPr>
           <w:rFonts w:ascii="Georgia" w:hAnsi="Georgia"/>
         </w:rPr>

</xml_diff>